<commit_message>
Testseite live geschaltet (Stand: 75009d0 📮 Briefkasten-Block mit klarem Abstand zum Material)
</commit_message>
<xml_diff>
--- a/sva/SVA-Dossier-Vorlage.docx
+++ b/sva/SVA-Dossier-Vorlage.docx
@@ -1607,7 +1607,7 @@
         <w:ind w:left="720" w:hanging="360"/>
       </w:pPr>
       <w:rPr>
-        <w:rFonts w:ascii="Arial" w:eastAsia="Times New Roman" w:hAnsi="Arial" w:cs="Arial" w:hint="default"/>
+        <w:rFonts w:ascii="Calibri" w:eastAsia="Times New Roman" w:hAnsi="Calibri" w:cs="Calibri" w:hint="default"/>
       </w:rPr>
     </w:lvl>
     <w:lvl w:ilvl="1" w:tplc="04070003" w:tentative="1">
@@ -1886,7 +1886,7 @@
         <w:ind w:left="720" w:hanging="360"/>
       </w:pPr>
       <w:rPr>
-        <w:rFonts w:ascii="Arial" w:eastAsia="Times New Roman" w:hAnsi="Arial" w:cs="Arial" w:hint="default"/>
+        <w:rFonts w:ascii="Calibri" w:eastAsia="Times New Roman" w:hAnsi="Calibri" w:cs="Calibri" w:hint="default"/>
       </w:rPr>
     </w:lvl>
     <w:lvl w:ilvl="1" w:tplc="04070003" w:tentative="1">
@@ -2396,7 +2396,7 @@
   <w:docDefaults>
     <w:rPrDefault>
       <w:rPr>
-        <w:rFonts w:ascii="Times New Roman" w:eastAsia="Times New Roman" w:hAnsi="Times New Roman" w:cs="Times New Roman"/>
+        <w:rFonts w:ascii="Calibri" w:eastAsia="Calibri" w:hAnsi="Calibri" w:cs="Calibri"/>
         <w:lang w:val="de-CH" w:eastAsia="de-CH" w:bidi="ar-SA"/>
       </w:rPr>
     </w:rPrDefault>
@@ -2694,6 +2694,7 @@
       <w:jc w:val="both"/>
     </w:pPr>
     <w:rPr>
+      <w:rFonts w:ascii="Calibri" w:hAnsi="Calibri" w:cs="Calibri"/>
       <w:sz w:val="24"/>
       <w:szCs w:val="24"/>
       <w:lang w:eastAsia="de-DE"/>

</xml_diff>

<commit_message>
Testseite live geschaltet (Stand: 4eb781b 🎓 SVA: Grobkonzept und Rapporte per Knopf als PDF direkt in den Briefkasten, Druckfassung und leeres Blatt für jeden Reiter, Einträge pro Reiter löschen (Lehrpersonen), CSV in «Projekte der Klasse», Briefkasten grün nach Einwurf; Ansicht als Schüler:in ohne falsche Fehlermeldungen)
</commit_message>
<xml_diff>
--- a/sva/SVA-Dossier-Vorlage.docx
+++ b/sva/SVA-Dossier-Vorlage.docx
@@ -338,7 +338,9 @@
             <w:vMerge/>
           </w:tcPr>
           <w:p>
-            <w:pPr/>
+            <w:pPr>
+              <w:jc w:val="left"/>
+            </w:pPr>
           </w:p>
         </w:tc>
         <w:tc>
@@ -359,7 +361,9 @@
             </w:r>
           </w:p>
           <w:p>
-            <w:pPr/>
+            <w:pPr>
+              <w:jc w:val="left"/>
+            </w:pPr>
             <w:r>
               <w:rPr>
                 <w:rFonts w:ascii="Calibri" w:hAnsi="Calibri" w:cs="Calibri"/>
@@ -369,7 +373,9 @@
             </w:r>
           </w:p>
           <w:p>
-            <w:pPr/>
+            <w:pPr>
+              <w:jc w:val="left"/>
+            </w:pPr>
             <w:r>
               <w:rPr>
                 <w:rFonts w:ascii="Calibri" w:hAnsi="Calibri" w:cs="Calibri"/>
@@ -452,7 +458,9 @@
             <w:vMerge/>
           </w:tcPr>
           <w:p>
-            <w:pPr/>
+            <w:pPr>
+              <w:jc w:val="left"/>
+            </w:pPr>
           </w:p>
         </w:tc>
         <w:tc>
@@ -473,7 +481,9 @@
             </w:r>
           </w:p>
           <w:p>
-            <w:pPr/>
+            <w:pPr>
+              <w:jc w:val="left"/>
+            </w:pPr>
             <w:r>
               <w:rPr>
                 <w:rFonts w:ascii="Calibri" w:hAnsi="Calibri" w:cs="Calibri"/>
@@ -483,7 +493,9 @@
             </w:r>
           </w:p>
           <w:p>
-            <w:pPr/>
+            <w:pPr>
+              <w:jc w:val="left"/>
+            </w:pPr>
             <w:r>
               <w:rPr>
                 <w:rFonts w:ascii="Calibri" w:hAnsi="Calibri" w:cs="Calibri"/>

</xml_diff>